<commit_message>
Glossary word splits; passage practice builder; files refreshed
Co-Authored-By: Claude Fable 5.1 <noreply@anthropic.com>
Claude-Session: https://claude.ai/code/session_019gyiige9BuJUj3e3kcjvaS
</commit_message>
<xml_diff>
--- a/curious-incident/files/Curious Incident - Passage Panel Practice - Worksheet.docx
+++ b/curious-incident/files/Curious Incident - Passage Panel Practice - Worksheet.docx
@@ -177,15 +177,7 @@
           <w:sz w:val="20"/>
           <w:szCs w:val="20"/>
         </w:rPr>
-        <w:t xml:space="preserve">Chapter 2 · the opening. </w:t>
-      </w:r>
-      <w:r>
-        <w:rPr>
-          <w:rFonts w:ascii="Calibri" w:cs="Calibri" w:eastAsia="Calibri" w:hAnsi="Calibri"/>
-          <w:sz w:val="20"/>
-          <w:szCs w:val="20"/>
-        </w:rPr>
-        <w:t xml:space="preserve">What happens, how is it written, what does it show.</w:t>
+        <w:t xml:space="preserve">Chapter 2 · the opening</w:t>
       </w:r>
     </w:p>
     <w:tbl>
@@ -201,9 +193,9 @@
         </w:tblBorders>
       </w:tblPr>
       <w:tblGrid>
-        <w:gridCol w:w="2450"/>
-        <w:gridCol w:w="4738"/>
-        <w:gridCol w:w="2450"/>
+        <w:gridCol w:w="2500"/>
+        <w:gridCol w:w="4638"/>
+        <w:gridCol w:w="2500"/>
       </w:tblGrid>
       <w:tr>
         <w:trPr>
@@ -211,14 +203,13 @@
         </w:trPr>
         <w:tc>
           <w:tcPr>
-            <w:tcW w:type="dxa" w:w="2450"/>
+            <w:tcW w:type="dxa" w:w="2500"/>
             <w:tcBorders>
               <w:top w:val="single" w:color="C9BFAE" w:sz="4"/>
               <w:left w:val="single" w:color="C9BFAE" w:sz="4"/>
               <w:bottom w:val="single" w:color="C9BFAE" w:sz="4"/>
               <w:right w:val="single" w:color="C9BFAE" w:sz="4"/>
             </w:tcBorders>
-            <w:shd w:fill="F4EFE4" w:color="auto" w:val="clear"/>
             <w:tcMar>
               <w:top w:type="dxa" w:w="60"/>
               <w:left w:type="dxa" w:w="100"/>
@@ -236,42 +227,71 @@
                 <w:rFonts w:ascii="Calibri" w:cs="Calibri" w:eastAsia="Calibri" w:hAnsi="Calibri"/>
                 <w:b/>
                 <w:bCs/>
-                <w:caps/>
                 <w:color w:val="22304A"/>
-                <w:sz w:val="15"/>
-                <w:szCs w:val="15"/>
-              </w:rPr>
-              <w:t xml:space="preserve">What happens</w:t>
-            </w:r>
-          </w:p>
-          <w:p>
-            <w:pPr>
-              <w:spacing w:after="0" w:before="0"/>
-            </w:pPr>
+                <w:sz w:val="22"/>
+                <w:szCs w:val="22"/>
+              </w:rPr>
+              <w:t xml:space="preserve">①</w:t>
+            </w:r>
             <w:r>
               <w:rPr>
                 <w:rFonts w:ascii="Calibri" w:cs="Calibri" w:eastAsia="Calibri" w:hAnsi="Calibri"/>
-                <w:b/>
-                <w:bCs/>
-                <w:color w:val="22304A"/>
-                <w:sz w:val="19"/>
-                <w:szCs w:val="19"/>
-              </w:rPr>
-              <w:t xml:space="preserve">1. </w:t>
-            </w:r>
-            <w:r>
-              <w:rPr>
-                <w:rFonts w:ascii="Calibri" w:cs="Calibri" w:eastAsia="Calibri" w:hAnsi="Calibri"/>
-                <w:sz w:val="19"/>
-                <w:szCs w:val="19"/>
-              </w:rPr>
-              <w:t xml:space="preserve">Say what happens in this paragraph in one sentence.</w:t>
+                <w:color w:val="645D52"/>
+                <w:sz w:val="17"/>
+                <w:szCs w:val="17"/>
+              </w:rPr>
+              <w:t xml:space="preserve">  What is this doing?</w:t>
+            </w:r>
+          </w:p>
+          <w:p>
+            <w:pPr>
+              <w:pBdr>
+                <w:bottom w:val="single" w:color="C9BFAE" w:sz="4" w:space="1"/>
+              </w:pBdr>
+              <w:spacing w:after="0" w:before="0" w:line="440"/>
+            </w:pPr>
+            <w:r>
+              <w:rPr>
+                <w:sz w:val="20"/>
+                <w:szCs w:val="20"/>
+              </w:rPr>
+              <w:t xml:space="preserve"/>
+            </w:r>
+          </w:p>
+          <w:p>
+            <w:pPr>
+              <w:pBdr>
+                <w:bottom w:val="single" w:color="C9BFAE" w:sz="4" w:space="1"/>
+              </w:pBdr>
+              <w:spacing w:after="0" w:before="0" w:line="440"/>
+            </w:pPr>
+            <w:r>
+              <w:rPr>
+                <w:sz w:val="20"/>
+                <w:szCs w:val="20"/>
+              </w:rPr>
+              <w:t xml:space="preserve"/>
+            </w:r>
+          </w:p>
+          <w:p>
+            <w:pPr>
+              <w:pBdr>
+                <w:bottom w:val="single" w:color="C9BFAE" w:sz="4" w:space="1"/>
+              </w:pBdr>
+              <w:spacing w:after="0" w:before="0" w:line="440"/>
+            </w:pPr>
+            <w:r>
+              <w:rPr>
+                <w:sz w:val="20"/>
+                <w:szCs w:val="20"/>
+              </w:rPr>
+              <w:t xml:space="preserve"/>
             </w:r>
           </w:p>
         </w:tc>
         <w:tc>
           <w:tcPr>
-            <w:tcW w:type="dxa" w:w="4738"/>
+            <w:tcW w:type="dxa" w:w="4638"/>
             <w:tcBorders>
               <w:top w:val="none" w:color="FFFFFF" w:sz="0"/>
               <w:left w:val="single" w:color="C9BFAE" w:sz="4"/>
@@ -295,67 +315,66 @@
                 <w:sz w:val="20"/>
                 <w:szCs w:val="20"/>
               </w:rPr>
-              <w:t xml:space="preserve">It was 7 minutes after midnight. The dog was lying on the grass in the middle of the lawn in front of Mrs. Shears’s house. Its eyes were closed. It looked as if it was running on its side, the way dogs run when they think they are chasing a cat in a dream. But the dog was not running or asleep. The dog was dead.</w:t>
+              <w:t xml:space="preserve"/>
+            </w:r>
+            <w:r>
+              <w:rPr>
+                <w:rFonts w:ascii="Times New Roman" w:cs="Times New Roman" w:eastAsia="Times New Roman" w:hAnsi="Times New Roman"/>
+                <w:b/>
+                <w:bCs/>
+                <w:color w:val="22304A"/>
+                <w:sz w:val="20"/>
+                <w:szCs w:val="20"/>
+              </w:rPr>
+              <w:t xml:space="preserve">① </w:t>
+            </w:r>
+            <w:r>
+              <w:rPr>
+                <w:rFonts w:ascii="Times New Roman" w:cs="Times New Roman" w:eastAsia="Times New Roman" w:hAnsi="Times New Roman"/>
+                <w:b/>
+                <w:bCs/>
+                <w:sz w:val="20"/>
+                <w:szCs w:val="20"/>
+              </w:rPr>
+              <w:t xml:space="preserve">It was 7 minutes after midnight.</w:t>
+            </w:r>
+            <w:r>
+              <w:rPr>
+                <w:rFonts w:ascii="Times New Roman" w:cs="Times New Roman" w:eastAsia="Times New Roman" w:hAnsi="Times New Roman"/>
+                <w:sz w:val="20"/>
+                <w:szCs w:val="20"/>
+              </w:rPr>
+              <w:t xml:space="preserve"> The dog was lying on the grass in the middle of the lawn in front of Mrs. Shears’s house. Its eyes were closed. It looked as if it was running on its side, the way dogs run when they think they are chasing a cat in a dream. But the dog was not running or asleep. The dog was dead.</w:t>
             </w:r>
           </w:p>
         </w:tc>
         <w:tc>
           <w:tcPr>
-            <w:tcW w:type="dxa" w:w="2450"/>
+            <w:tcW w:type="dxa" w:w="2500"/>
             <w:tcBorders>
-              <w:top w:val="single" w:color="C9BFAE" w:sz="4"/>
-              <w:left w:val="single" w:color="C9BFAE" w:sz="4"/>
-              <w:bottom w:val="single" w:color="C9BFAE" w:sz="4"/>
-              <w:right w:val="single" w:color="C9BFAE" w:sz="4"/>
+              <w:top w:val="none" w:color="FFFFFF" w:sz="0"/>
+              <w:left w:val="none" w:color="FFFFFF" w:sz="0"/>
+              <w:bottom w:val="none" w:color="FFFFFF" w:sz="0"/>
+              <w:right w:val="none" w:color="FFFFFF" w:sz="0"/>
             </w:tcBorders>
-            <w:shd w:fill="F4EFE4" w:color="auto" w:val="clear"/>
             <w:tcMar>
               <w:top w:type="dxa" w:w="60"/>
               <w:left w:type="dxa" w:w="100"/>
               <w:bottom w:type="dxa" w:w="60"/>
               <w:right w:type="dxa" w:w="100"/>
             </w:tcMar>
-            <w:vAlign w:val="top"/>
           </w:tcPr>
           <w:p>
             <w:pPr>
-              <w:spacing w:after="20" w:before="0"/>
+              <w:spacing w:after="0" w:before="0"/>
             </w:pPr>
             <w:r>
               <w:rPr>
                 <w:rFonts w:ascii="Calibri" w:cs="Calibri" w:eastAsia="Calibri" w:hAnsi="Calibri"/>
-                <w:b/>
-                <w:bCs/>
-                <w:caps/>
-                <w:color w:val="22304A"/>
-                <w:sz w:val="15"/>
-                <w:szCs w:val="15"/>
-              </w:rPr>
-              <w:t xml:space="preserve">How is it written</w:t>
-            </w:r>
-          </w:p>
-          <w:p>
-            <w:pPr>
-              <w:spacing w:after="0" w:before="0"/>
-            </w:pPr>
-            <w:r>
-              <w:rPr>
-                <w:rFonts w:ascii="Calibri" w:cs="Calibri" w:eastAsia="Calibri" w:hAnsi="Calibri"/>
-                <w:b/>
-                <w:bCs/>
-                <w:color w:val="22304A"/>
-                <w:sz w:val="19"/>
-                <w:szCs w:val="19"/>
-              </w:rPr>
-              <w:t xml:space="preserve">2. </w:t>
-            </w:r>
-            <w:r>
-              <w:rPr>
-                <w:rFonts w:ascii="Calibri" w:cs="Calibri" w:eastAsia="Calibri" w:hAnsi="Calibri"/>
-                <w:sz w:val="19"/>
-                <w:szCs w:val="19"/>
-              </w:rPr>
-              <w:t xml:space="preserve">Circle the time. Why so exact?</w:t>
+                <w:sz w:val="21"/>
+                <w:szCs w:val="21"/>
+              </w:rPr>
+              <w:t xml:space="preserve"/>
             </w:r>
           </w:p>
         </w:tc>
@@ -366,67 +385,37 @@
         </w:trPr>
         <w:tc>
           <w:tcPr>
-            <w:tcW w:type="dxa" w:w="2450"/>
+            <w:tcW w:type="dxa" w:w="2500"/>
             <w:tcBorders>
-              <w:top w:val="single" w:color="C9BFAE" w:sz="4"/>
-              <w:left w:val="single" w:color="C9BFAE" w:sz="4"/>
-              <w:bottom w:val="single" w:color="C9BFAE" w:sz="4"/>
-              <w:right w:val="single" w:color="C9BFAE" w:sz="4"/>
+              <w:top w:val="none" w:color="FFFFFF" w:sz="0"/>
+              <w:left w:val="none" w:color="FFFFFF" w:sz="0"/>
+              <w:bottom w:val="none" w:color="FFFFFF" w:sz="0"/>
+              <w:right w:val="none" w:color="FFFFFF" w:sz="0"/>
             </w:tcBorders>
-            <w:shd w:fill="F4EFE4" w:color="auto" w:val="clear"/>
             <w:tcMar>
               <w:top w:type="dxa" w:w="60"/>
               <w:left w:type="dxa" w:w="100"/>
               <w:bottom w:type="dxa" w:w="60"/>
               <w:right w:type="dxa" w:w="100"/>
             </w:tcMar>
-            <w:vAlign w:val="top"/>
           </w:tcPr>
           <w:p>
             <w:pPr>
-              <w:spacing w:after="20" w:before="0"/>
+              <w:spacing w:after="0" w:before="0"/>
             </w:pPr>
             <w:r>
               <w:rPr>
                 <w:rFonts w:ascii="Calibri" w:cs="Calibri" w:eastAsia="Calibri" w:hAnsi="Calibri"/>
-                <w:b/>
-                <w:bCs/>
-                <w:caps/>
-                <w:color w:val="22304A"/>
-                <w:sz w:val="15"/>
-                <w:szCs w:val="15"/>
-              </w:rPr>
-              <w:t xml:space="preserve">How is it written</w:t>
-            </w:r>
-          </w:p>
-          <w:p>
-            <w:pPr>
-              <w:spacing w:after="0" w:before="0"/>
-            </w:pPr>
-            <w:r>
-              <w:rPr>
-                <w:rFonts w:ascii="Calibri" w:cs="Calibri" w:eastAsia="Calibri" w:hAnsi="Calibri"/>
-                <w:b/>
-                <w:bCs/>
-                <w:color w:val="22304A"/>
-                <w:sz w:val="19"/>
-                <w:szCs w:val="19"/>
-              </w:rPr>
-              <w:t xml:space="preserve">3. </w:t>
-            </w:r>
-            <w:r>
-              <w:rPr>
-                <w:rFonts w:ascii="Calibri" w:cs="Calibri" w:eastAsia="Calibri" w:hAnsi="Calibri"/>
-                <w:sz w:val="19"/>
-                <w:szCs w:val="19"/>
-              </w:rPr>
-              <w:t xml:space="preserve">Underline the sentence where Christopher works out how the dog died. What kind of thinking is this?</w:t>
+                <w:sz w:val="21"/>
+                <w:szCs w:val="21"/>
+              </w:rPr>
+              <w:t xml:space="preserve"/>
             </w:r>
           </w:p>
         </w:tc>
         <w:tc>
           <w:tcPr>
-            <w:tcW w:type="dxa" w:w="4738"/>
+            <w:tcW w:type="dxa" w:w="4638"/>
             <w:tcBorders>
               <w:top w:val="none" w:color="FFFFFF" w:sz="0"/>
               <w:left w:val="single" w:color="C9BFAE" w:sz="4"/>
@@ -450,20 +439,48 @@
                 <w:sz w:val="20"/>
                 <w:szCs w:val="20"/>
               </w:rPr>
-              <w:t xml:space="preserve">There was a garden fork sticking out of the dog. The points of the fork must have gone all the way through the dog and into the ground because the fork had not fallen over. I decided that the dog was probably killed with the fork because I could not see any other wounds in the dog and I do not think you would stick a garden fork into a dog after it had died for some other reason, like cancer, for example, or a road accident. But I could not be certain about this.</w:t>
+              <w:t xml:space="preserve">There was a garden fork sticking out of the dog. The points of the fork must have gone all the way through the dog and into the ground because the fork had not fallen over. </w:t>
+            </w:r>
+            <w:r>
+              <w:rPr>
+                <w:rFonts w:ascii="Times New Roman" w:cs="Times New Roman" w:eastAsia="Times New Roman" w:hAnsi="Times New Roman"/>
+                <w:b/>
+                <w:bCs/>
+                <w:color w:val="22304A"/>
+                <w:sz w:val="20"/>
+                <w:szCs w:val="20"/>
+              </w:rPr>
+              <w:t xml:space="preserve">② </w:t>
+            </w:r>
+            <w:r>
+              <w:rPr>
+                <w:rFonts w:ascii="Times New Roman" w:cs="Times New Roman" w:eastAsia="Times New Roman" w:hAnsi="Times New Roman"/>
+                <w:b/>
+                <w:bCs/>
+                <w:sz w:val="20"/>
+                <w:szCs w:val="20"/>
+              </w:rPr>
+              <w:t xml:space="preserve">I decided that the dog was probably killed with the fork because I could not see any other wounds in the dog</w:t>
+            </w:r>
+            <w:r>
+              <w:rPr>
+                <w:rFonts w:ascii="Times New Roman" w:cs="Times New Roman" w:eastAsia="Times New Roman" w:hAnsi="Times New Roman"/>
+                <w:sz w:val="20"/>
+                <w:szCs w:val="20"/>
+              </w:rPr>
+              <w:t xml:space="preserve"> and I do not think you would stick a garden fork into a dog after it had died for some other reason, like cancer, for example, or a road accident. But I could not be certain about this.</w:t>
             </w:r>
           </w:p>
         </w:tc>
         <w:tc>
           <w:tcPr>
-            <w:tcW w:type="dxa" w:w="2450"/>
+            <w:tcW w:type="dxa" w:w="2500"/>
             <w:tcBorders>
               <w:top w:val="single" w:color="C9BFAE" w:sz="4"/>
               <w:left w:val="single" w:color="C9BFAE" w:sz="4"/>
               <w:bottom w:val="single" w:color="C9BFAE" w:sz="4"/>
               <w:right w:val="single" w:color="C9BFAE" w:sz="4"/>
             </w:tcBorders>
-            <w:shd w:fill="F4EFE4" w:color="auto" w:val="clear"/>
             <w:tcMar>
               <w:top w:type="dxa" w:w="60"/>
               <w:left w:type="dxa" w:w="100"/>
@@ -481,36 +498,65 @@
                 <w:rFonts w:ascii="Calibri" w:cs="Calibri" w:eastAsia="Calibri" w:hAnsi="Calibri"/>
                 <w:b/>
                 <w:bCs/>
-                <w:caps/>
                 <w:color w:val="22304A"/>
-                <w:sz w:val="15"/>
-                <w:szCs w:val="15"/>
-              </w:rPr>
-              <w:t xml:space="preserve">What does it show</w:t>
-            </w:r>
-          </w:p>
-          <w:p>
-            <w:pPr>
-              <w:spacing w:after="0" w:before="0"/>
-            </w:pPr>
+                <w:sz w:val="22"/>
+                <w:szCs w:val="22"/>
+              </w:rPr>
+              <w:t xml:space="preserve">②</w:t>
+            </w:r>
             <w:r>
               <w:rPr>
                 <w:rFonts w:ascii="Calibri" w:cs="Calibri" w:eastAsia="Calibri" w:hAnsi="Calibri"/>
-                <w:b/>
-                <w:bCs/>
-                <w:color w:val="22304A"/>
-                <w:sz w:val="19"/>
-                <w:szCs w:val="19"/>
-              </w:rPr>
-              <w:t xml:space="preserve">4. </w:t>
-            </w:r>
-            <w:r>
-              <w:rPr>
-                <w:rFonts w:ascii="Calibri" w:cs="Calibri" w:eastAsia="Calibri" w:hAnsi="Calibri"/>
-                <w:sz w:val="19"/>
-                <w:szCs w:val="19"/>
-              </w:rPr>
-              <w:t xml:space="preserve">'But I could not be certain about this.' What does this line show about him?</w:t>
+                <w:color w:val="645D52"/>
+                <w:sz w:val="17"/>
+                <w:szCs w:val="17"/>
+              </w:rPr>
+              <w:t xml:space="preserve">  What is this doing?</w:t>
+            </w:r>
+          </w:p>
+          <w:p>
+            <w:pPr>
+              <w:pBdr>
+                <w:bottom w:val="single" w:color="C9BFAE" w:sz="4" w:space="1"/>
+              </w:pBdr>
+              <w:spacing w:after="0" w:before="0" w:line="440"/>
+            </w:pPr>
+            <w:r>
+              <w:rPr>
+                <w:sz w:val="20"/>
+                <w:szCs w:val="20"/>
+              </w:rPr>
+              <w:t xml:space="preserve"/>
+            </w:r>
+          </w:p>
+          <w:p>
+            <w:pPr>
+              <w:pBdr>
+                <w:bottom w:val="single" w:color="C9BFAE" w:sz="4" w:space="1"/>
+              </w:pBdr>
+              <w:spacing w:after="0" w:before="0" w:line="440"/>
+            </w:pPr>
+            <w:r>
+              <w:rPr>
+                <w:sz w:val="20"/>
+                <w:szCs w:val="20"/>
+              </w:rPr>
+              <w:t xml:space="preserve"/>
+            </w:r>
+          </w:p>
+          <w:p>
+            <w:pPr>
+              <w:pBdr>
+                <w:bottom w:val="single" w:color="C9BFAE" w:sz="4" w:space="1"/>
+              </w:pBdr>
+              <w:spacing w:after="0" w:before="0" w:line="440"/>
+            </w:pPr>
+            <w:r>
+              <w:rPr>
+                <w:sz w:val="20"/>
+                <w:szCs w:val="20"/>
+              </w:rPr>
+              <w:t xml:space="preserve"/>
             </w:r>
           </w:p>
         </w:tc>
@@ -521,14 +567,13 @@
         </w:trPr>
         <w:tc>
           <w:tcPr>
-            <w:tcW w:type="dxa" w:w="2450"/>
+            <w:tcW w:type="dxa" w:w="2500"/>
             <w:tcBorders>
               <w:top w:val="single" w:color="C9BFAE" w:sz="4"/>
               <w:left w:val="single" w:color="C9BFAE" w:sz="4"/>
               <w:bottom w:val="single" w:color="C9BFAE" w:sz="4"/>
               <w:right w:val="single" w:color="C9BFAE" w:sz="4"/>
             </w:tcBorders>
-            <w:shd w:fill="F4EFE4" w:color="auto" w:val="clear"/>
             <w:tcMar>
               <w:top w:type="dxa" w:w="60"/>
               <w:left w:type="dxa" w:w="100"/>
@@ -546,42 +591,71 @@
                 <w:rFonts w:ascii="Calibri" w:cs="Calibri" w:eastAsia="Calibri" w:hAnsi="Calibri"/>
                 <w:b/>
                 <w:bCs/>
-                <w:caps/>
                 <w:color w:val="22304A"/>
-                <w:sz w:val="15"/>
-                <w:szCs w:val="15"/>
-              </w:rPr>
-              <w:t xml:space="preserve">How is it written</w:t>
-            </w:r>
-          </w:p>
-          <w:p>
-            <w:pPr>
-              <w:spacing w:after="0" w:before="0"/>
-            </w:pPr>
+                <w:sz w:val="22"/>
+                <w:szCs w:val="22"/>
+              </w:rPr>
+              <w:t xml:space="preserve">③</w:t>
+            </w:r>
             <w:r>
               <w:rPr>
                 <w:rFonts w:ascii="Calibri" w:cs="Calibri" w:eastAsia="Calibri" w:hAnsi="Calibri"/>
-                <w:b/>
-                <w:bCs/>
-                <w:color w:val="22304A"/>
-                <w:sz w:val="19"/>
-                <w:szCs w:val="19"/>
-              </w:rPr>
-              <w:t xml:space="preserve">5. </w:t>
-            </w:r>
-            <w:r>
-              <w:rPr>
-                <w:rFonts w:ascii="Calibri" w:cs="Calibri" w:eastAsia="Calibri" w:hAnsi="Calibri"/>
-                <w:sz w:val="19"/>
-                <w:szCs w:val="19"/>
-              </w:rPr>
-              <w:t xml:space="preserve">Count the sentences that start with 'I'. What does he do? What does he not say?</w:t>
+                <w:color w:val="645D52"/>
+                <w:sz w:val="17"/>
+                <w:szCs w:val="17"/>
+              </w:rPr>
+              <w:t xml:space="preserve">  What is this doing?</w:t>
+            </w:r>
+          </w:p>
+          <w:p>
+            <w:pPr>
+              <w:pBdr>
+                <w:bottom w:val="single" w:color="C9BFAE" w:sz="4" w:space="1"/>
+              </w:pBdr>
+              <w:spacing w:after="0" w:before="0" w:line="440"/>
+            </w:pPr>
+            <w:r>
+              <w:rPr>
+                <w:sz w:val="20"/>
+                <w:szCs w:val="20"/>
+              </w:rPr>
+              <w:t xml:space="preserve"/>
+            </w:r>
+          </w:p>
+          <w:p>
+            <w:pPr>
+              <w:pBdr>
+                <w:bottom w:val="single" w:color="C9BFAE" w:sz="4" w:space="1"/>
+              </w:pBdr>
+              <w:spacing w:after="0" w:before="0" w:line="440"/>
+            </w:pPr>
+            <w:r>
+              <w:rPr>
+                <w:sz w:val="20"/>
+                <w:szCs w:val="20"/>
+              </w:rPr>
+              <w:t xml:space="preserve"/>
+            </w:r>
+          </w:p>
+          <w:p>
+            <w:pPr>
+              <w:pBdr>
+                <w:bottom w:val="single" w:color="C9BFAE" w:sz="4" w:space="1"/>
+              </w:pBdr>
+              <w:spacing w:after="0" w:before="0" w:line="440"/>
+            </w:pPr>
+            <w:r>
+              <w:rPr>
+                <w:sz w:val="20"/>
+                <w:szCs w:val="20"/>
+              </w:rPr>
+              <w:t xml:space="preserve"/>
             </w:r>
           </w:p>
         </w:tc>
         <w:tc>
           <w:tcPr>
-            <w:tcW w:type="dxa" w:w="4738"/>
+            <w:tcW w:type="dxa" w:w="4638"/>
             <w:tcBorders>
               <w:top w:val="none" w:color="FFFFFF" w:sz="0"/>
               <w:left w:val="single" w:color="C9BFAE" w:sz="4"/>
@@ -605,7 +679,36 @@
                 <w:sz w:val="20"/>
                 <w:szCs w:val="20"/>
               </w:rPr>
-              <w:t xml:space="preserve">I went through Mrs. Shears’s gate, closing it behind me. I walked onto her lawn and knelt beside the dog. I put my hand on the muzzle of the dog. It was still warm.</w:t>
+              <w:t xml:space="preserve">I went through Mrs. Shears’s gate, closing it behind me. I walked onto her lawn and knelt beside the dog. I put my hand on the muzzle of the dog. </w:t>
+            </w:r>
+            <w:r>
+              <w:rPr>
+                <w:rFonts w:ascii="Times New Roman" w:cs="Times New Roman" w:eastAsia="Times New Roman" w:hAnsi="Times New Roman"/>
+                <w:b/>
+                <w:bCs/>
+                <w:color w:val="22304A"/>
+                <w:sz w:val="20"/>
+                <w:szCs w:val="20"/>
+              </w:rPr>
+              <w:t xml:space="preserve">③ </w:t>
+            </w:r>
+            <w:r>
+              <w:rPr>
+                <w:rFonts w:ascii="Times New Roman" w:cs="Times New Roman" w:eastAsia="Times New Roman" w:hAnsi="Times New Roman"/>
+                <w:b/>
+                <w:bCs/>
+                <w:sz w:val="20"/>
+                <w:szCs w:val="20"/>
+              </w:rPr>
+              <w:t xml:space="preserve">It was still warm.</w:t>
+            </w:r>
+            <w:r>
+              <w:rPr>
+                <w:rFonts w:ascii="Times New Roman" w:cs="Times New Roman" w:eastAsia="Times New Roman" w:hAnsi="Times New Roman"/>
+                <w:sz w:val="20"/>
+                <w:szCs w:val="20"/>
+              </w:rPr>
+              <w:t xml:space="preserve"/>
             </w:r>
           </w:p>
           <w:p>
@@ -624,61 +727,31 @@
         </w:tc>
         <w:tc>
           <w:tcPr>
-            <w:tcW w:type="dxa" w:w="2450"/>
+            <w:tcW w:type="dxa" w:w="2500"/>
             <w:tcBorders>
-              <w:top w:val="single" w:color="C9BFAE" w:sz="4"/>
-              <w:left w:val="single" w:color="C9BFAE" w:sz="4"/>
-              <w:bottom w:val="single" w:color="C9BFAE" w:sz="4"/>
-              <w:right w:val="single" w:color="C9BFAE" w:sz="4"/>
+              <w:top w:val="none" w:color="FFFFFF" w:sz="0"/>
+              <w:left w:val="none" w:color="FFFFFF" w:sz="0"/>
+              <w:bottom w:val="none" w:color="FFFFFF" w:sz="0"/>
+              <w:right w:val="none" w:color="FFFFFF" w:sz="0"/>
             </w:tcBorders>
-            <w:shd w:fill="F4EFE4" w:color="auto" w:val="clear"/>
             <w:tcMar>
               <w:top w:type="dxa" w:w="60"/>
               <w:left w:type="dxa" w:w="100"/>
               <w:bottom w:type="dxa" w:w="60"/>
               <w:right w:type="dxa" w:w="100"/>
             </w:tcMar>
-            <w:vAlign w:val="top"/>
           </w:tcPr>
           <w:p>
             <w:pPr>
-              <w:spacing w:after="20" w:before="0"/>
+              <w:spacing w:after="0" w:before="0"/>
             </w:pPr>
             <w:r>
               <w:rPr>
                 <w:rFonts w:ascii="Calibri" w:cs="Calibri" w:eastAsia="Calibri" w:hAnsi="Calibri"/>
-                <w:b/>
-                <w:bCs/>
-                <w:caps/>
-                <w:color w:val="22304A"/>
-                <w:sz w:val="15"/>
-                <w:szCs w:val="15"/>
-              </w:rPr>
-              <w:t xml:space="preserve">What does it show</w:t>
-            </w:r>
-          </w:p>
-          <w:p>
-            <w:pPr>
-              <w:spacing w:after="0" w:before="0"/>
-            </w:pPr>
-            <w:r>
-              <w:rPr>
-                <w:rFonts w:ascii="Calibri" w:cs="Calibri" w:eastAsia="Calibri" w:hAnsi="Calibri"/>
-                <w:b/>
-                <w:bCs/>
-                <w:color w:val="22304A"/>
-                <w:sz w:val="19"/>
-                <w:szCs w:val="19"/>
-              </w:rPr>
-              <w:t xml:space="preserve">6. </w:t>
-            </w:r>
-            <w:r>
-              <w:rPr>
-                <w:rFonts w:ascii="Calibri" w:cs="Calibri" w:eastAsia="Calibri" w:hAnsi="Calibri"/>
-                <w:sz w:val="19"/>
-                <w:szCs w:val="19"/>
-              </w:rPr>
-              <w:t xml:space="preserve">He kneels and touches the dog. What does this show that the words do not say?</w:t>
+                <w:sz w:val="21"/>
+                <w:szCs w:val="21"/>
+              </w:rPr>
+              <w:t xml:space="preserve"/>
             </w:r>
           </w:p>
         </w:tc>
@@ -689,67 +762,37 @@
         </w:trPr>
         <w:tc>
           <w:tcPr>
-            <w:tcW w:type="dxa" w:w="2450"/>
+            <w:tcW w:type="dxa" w:w="2500"/>
             <w:tcBorders>
-              <w:top w:val="single" w:color="C9BFAE" w:sz="4"/>
-              <w:left w:val="single" w:color="C9BFAE" w:sz="4"/>
-              <w:bottom w:val="single" w:color="C9BFAE" w:sz="4"/>
-              <w:right w:val="single" w:color="C9BFAE" w:sz="4"/>
+              <w:top w:val="none" w:color="FFFFFF" w:sz="0"/>
+              <w:left w:val="none" w:color="FFFFFF" w:sz="0"/>
+              <w:bottom w:val="none" w:color="FFFFFF" w:sz="0"/>
+              <w:right w:val="none" w:color="FFFFFF" w:sz="0"/>
             </w:tcBorders>
-            <w:shd w:fill="F4EFE4" w:color="auto" w:val="clear"/>
             <w:tcMar>
               <w:top w:type="dxa" w:w="60"/>
               <w:left w:type="dxa" w:w="100"/>
               <w:bottom w:type="dxa" w:w="60"/>
               <w:right w:type="dxa" w:w="100"/>
             </w:tcMar>
-            <w:vAlign w:val="top"/>
           </w:tcPr>
           <w:p>
             <w:pPr>
-              <w:spacing w:after="20" w:before="0"/>
+              <w:spacing w:after="0" w:before="0"/>
             </w:pPr>
             <w:r>
               <w:rPr>
                 <w:rFonts w:ascii="Calibri" w:cs="Calibri" w:eastAsia="Calibri" w:hAnsi="Calibri"/>
-                <w:b/>
-                <w:bCs/>
-                <w:caps/>
-                <w:color w:val="22304A"/>
-                <w:sz w:val="15"/>
-                <w:szCs w:val="15"/>
-              </w:rPr>
-              <w:t xml:space="preserve">How is it written</w:t>
-            </w:r>
-          </w:p>
-          <w:p>
-            <w:pPr>
-              <w:spacing w:after="0" w:before="0"/>
-            </w:pPr>
-            <w:r>
-              <w:rPr>
-                <w:rFonts w:ascii="Calibri" w:cs="Calibri" w:eastAsia="Calibri" w:hAnsi="Calibri"/>
-                <w:b/>
-                <w:bCs/>
-                <w:color w:val="22304A"/>
-                <w:sz w:val="19"/>
-                <w:szCs w:val="19"/>
-              </w:rPr>
-              <w:t xml:space="preserve">7. </w:t>
-            </w:r>
-            <w:r>
-              <w:rPr>
-                <w:rFonts w:ascii="Calibri" w:cs="Calibri" w:eastAsia="Calibri" w:hAnsi="Calibri"/>
-                <w:sz w:val="19"/>
-                <w:szCs w:val="19"/>
-              </w:rPr>
-              <w:t xml:space="preserve">Box the comparison at the end of the poodle paragraph. Is it a normal thing to notice?</w:t>
+                <w:sz w:val="21"/>
+                <w:szCs w:val="21"/>
+              </w:rPr>
+              <w:t xml:space="preserve"/>
             </w:r>
           </w:p>
         </w:tc>
         <w:tc>
           <w:tcPr>
-            <w:tcW w:type="dxa" w:w="4738"/>
+            <w:tcW w:type="dxa" w:w="4638"/>
             <w:tcBorders>
               <w:top w:val="none" w:color="FFFFFF" w:sz="0"/>
               <w:left w:val="single" w:color="C9BFAE" w:sz="4"/>
@@ -773,7 +816,36 @@
                 <w:sz w:val="20"/>
                 <w:szCs w:val="20"/>
               </w:rPr>
-              <w:t xml:space="preserve">Wellington was a poodle. Not one of the small poodles that have hairstyles but a big poodle. It had curly black fur, but when you got close you could see that the skin underneath the fur was a very pale yellow, like chicken.</w:t>
+              <w:t xml:space="preserve">Wellington was a poodle. Not one of the small poodles that have hairstyles but a big poodle. It had curly black fur, but when you got close you could see that the skin underneath the fur was a very pale yellow, </w:t>
+            </w:r>
+            <w:r>
+              <w:rPr>
+                <w:rFonts w:ascii="Times New Roman" w:cs="Times New Roman" w:eastAsia="Times New Roman" w:hAnsi="Times New Roman"/>
+                <w:b/>
+                <w:bCs/>
+                <w:color w:val="22304A"/>
+                <w:sz w:val="20"/>
+                <w:szCs w:val="20"/>
+              </w:rPr>
+              <w:t xml:space="preserve">④ </w:t>
+            </w:r>
+            <w:r>
+              <w:rPr>
+                <w:rFonts w:ascii="Times New Roman" w:cs="Times New Roman" w:eastAsia="Times New Roman" w:hAnsi="Times New Roman"/>
+                <w:b/>
+                <w:bCs/>
+                <w:sz w:val="20"/>
+                <w:szCs w:val="20"/>
+              </w:rPr>
+              <w:t xml:space="preserve">like chicken</w:t>
+            </w:r>
+            <w:r>
+              <w:rPr>
+                <w:rFonts w:ascii="Times New Roman" w:cs="Times New Roman" w:eastAsia="Times New Roman" w:hAnsi="Times New Roman"/>
+                <w:sz w:val="20"/>
+                <w:szCs w:val="20"/>
+              </w:rPr>
+              <w:t xml:space="preserve">.</w:t>
             </w:r>
           </w:p>
           <w:p>
@@ -792,14 +864,13 @@
         </w:tc>
         <w:tc>
           <w:tcPr>
-            <w:tcW w:type="dxa" w:w="2450"/>
+            <w:tcW w:type="dxa" w:w="2500"/>
             <w:tcBorders>
               <w:top w:val="single" w:color="C9BFAE" w:sz="4"/>
               <w:left w:val="single" w:color="C9BFAE" w:sz="4"/>
               <w:bottom w:val="single" w:color="C9BFAE" w:sz="4"/>
               <w:right w:val="single" w:color="C9BFAE" w:sz="4"/>
             </w:tcBorders>
-            <w:shd w:fill="F4EFE4" w:color="auto" w:val="clear"/>
             <w:tcMar>
               <w:top w:type="dxa" w:w="60"/>
               <w:left w:type="dxa" w:w="100"/>
@@ -817,57 +888,78 @@
                 <w:rFonts w:ascii="Calibri" w:cs="Calibri" w:eastAsia="Calibri" w:hAnsi="Calibri"/>
                 <w:b/>
                 <w:bCs/>
-                <w:caps/>
                 <w:color w:val="22304A"/>
-                <w:sz w:val="15"/>
-                <w:szCs w:val="15"/>
-              </w:rPr>
-              <w:t xml:space="preserve">What does it show</w:t>
-            </w:r>
-          </w:p>
-          <w:p>
-            <w:pPr>
-              <w:spacing w:after="0" w:before="0"/>
-            </w:pPr>
+                <w:sz w:val="22"/>
+                <w:szCs w:val="22"/>
+              </w:rPr>
+              <w:t xml:space="preserve">④</w:t>
+            </w:r>
             <w:r>
               <w:rPr>
                 <w:rFonts w:ascii="Calibri" w:cs="Calibri" w:eastAsia="Calibri" w:hAnsi="Calibri"/>
-                <w:b/>
-                <w:bCs/>
-                <w:color w:val="22304A"/>
-                <w:sz w:val="19"/>
-                <w:szCs w:val="19"/>
-              </w:rPr>
-              <w:t xml:space="preserve">8. </w:t>
-            </w:r>
-            <w:r>
-              <w:rPr>
-                <w:rFonts w:ascii="Calibri" w:cs="Calibri" w:eastAsia="Calibri" w:hAnsi="Calibri"/>
-                <w:sz w:val="19"/>
-                <w:szCs w:val="19"/>
-              </w:rPr>
-              <w:t xml:space="preserve">The last line has two questions in it. Which one does the novel answer?</w:t>
+                <w:color w:val="645D52"/>
+                <w:sz w:val="17"/>
+                <w:szCs w:val="17"/>
+              </w:rPr>
+              <w:t xml:space="preserve">  What is this doing?</w:t>
+            </w:r>
+          </w:p>
+          <w:p>
+            <w:pPr>
+              <w:pBdr>
+                <w:bottom w:val="single" w:color="C9BFAE" w:sz="4" w:space="1"/>
+              </w:pBdr>
+              <w:spacing w:after="0" w:before="0" w:line="440"/>
+            </w:pPr>
+            <w:r>
+              <w:rPr>
+                <w:sz w:val="20"/>
+                <w:szCs w:val="20"/>
+              </w:rPr>
+              <w:t xml:space="preserve"/>
+            </w:r>
+          </w:p>
+          <w:p>
+            <w:pPr>
+              <w:pBdr>
+                <w:bottom w:val="single" w:color="C9BFAE" w:sz="4" w:space="1"/>
+              </w:pBdr>
+              <w:spacing w:after="0" w:before="0" w:line="440"/>
+            </w:pPr>
+            <w:r>
+              <w:rPr>
+                <w:sz w:val="20"/>
+                <w:szCs w:val="20"/>
+              </w:rPr>
+              <w:t xml:space="preserve"/>
+            </w:r>
+          </w:p>
+          <w:p>
+            <w:pPr>
+              <w:pBdr>
+                <w:bottom w:val="single" w:color="C9BFAE" w:sz="4" w:space="1"/>
+              </w:pBdr>
+              <w:spacing w:after="0" w:before="0" w:line="440"/>
+            </w:pPr>
+            <w:r>
+              <w:rPr>
+                <w:sz w:val="20"/>
+                <w:szCs w:val="20"/>
+              </w:rPr>
+              <w:t xml:space="preserve"/>
             </w:r>
           </w:p>
         </w:tc>
       </w:tr>
     </w:tbl>
     <w:p>
-      <w:pPr>
-        <w:spacing w:after="120" w:before="0"/>
-      </w:pPr>
-      <w:r>
-        <w:rPr>
-          <w:rFonts w:ascii="Calibri" w:cs="Calibri" w:eastAsia="Calibri" w:hAnsi="Calibri"/>
-          <w:sz w:val="21"/>
-          <w:szCs w:val="21"/>
-        </w:rPr>
-        <w:t xml:space="preserve"/>
-      </w:r>
-    </w:p>
-    <w:p>
-      <w:pPr>
-        <w:spacing w:after="60" w:before="0"/>
+      <w:r>
+        <w:br w:type="page"/>
+      </w:r>
+    </w:p>
+    <w:p>
+      <w:pPr>
+        <w:spacing w:after="40" w:before="0"/>
       </w:pPr>
       <w:r>
         <w:rPr>
@@ -875,24 +967,16 @@
           <w:b/>
           <w:bCs/>
           <w:color w:val="22304A"/>
-          <w:sz w:val="20"/>
-          <w:szCs w:val="20"/>
-        </w:rPr>
-        <w:t xml:space="preserve">Panel talk. </w:t>
-      </w:r>
-      <w:r>
-        <w:rPr>
-          <w:rFonts w:ascii="Calibri" w:cs="Calibri" w:eastAsia="Calibri" w:hAnsi="Calibri"/>
-          <w:sz w:val="20"/>
-          <w:szCs w:val="20"/>
-        </w:rPr>
-        <w:t xml:space="preserve">Groups of four. Someone reads. Take the three questions in order. Every turn starts with “Yes, and …” or a question to the last speaker. Everyone points at a word.</w:t>
+          <w:sz w:val="24"/>
+          <w:szCs w:val="24"/>
+        </w:rPr>
+        <w:t xml:space="preserve">Find a line</w:t>
       </w:r>
     </w:p>
     <w:p>
       <w:pPr>
         <w:keepNext/>
-        <w:spacing w:after="20" w:before="80"/>
+        <w:spacing w:after="20" w:before="120"/>
       </w:pPr>
       <w:r>
         <w:rPr>
@@ -900,10 +984,35 @@
           <w:b/>
           <w:bCs/>
           <w:color w:val="22304A"/>
-          <w:sz w:val="20"/>
-          <w:szCs w:val="20"/>
-        </w:rPr>
-        <w:t xml:space="preserve">The one thing our table would tell the class:</w:t>
+          <w:sz w:val="21"/>
+          <w:szCs w:val="21"/>
+        </w:rPr>
+        <w:t xml:space="preserve">Find a line </w:t>
+      </w:r>
+      <w:r>
+        <w:rPr>
+          <w:rFonts w:ascii="Calibri" w:cs="Calibri" w:eastAsia="Calibri" w:hAnsi="Calibri"/>
+          <w:sz w:val="21"/>
+          <w:szCs w:val="21"/>
+        </w:rPr>
+        <w:t xml:space="preserve">… that shows you something about how Christopher thinks.</w:t>
+      </w:r>
+    </w:p>
+    <w:p>
+      <w:pPr>
+        <w:keepNext/>
+        <w:spacing w:after="0" w:before="0"/>
+      </w:pPr>
+      <w:r>
+        <w:rPr>
+          <w:rFonts w:ascii="Calibri" w:cs="Calibri" w:eastAsia="Calibri" w:hAnsi="Calibri"/>
+          <w:b/>
+          <w:bCs/>
+          <w:color w:val="645D52"/>
+          <w:sz w:val="17"/>
+          <w:szCs w:val="17"/>
+        </w:rPr>
+        <w:t xml:space="preserve">The line:</w:t>
       </w:r>
     </w:p>
     <w:p>
@@ -938,6 +1047,23 @@
     </w:p>
     <w:p>
       <w:pPr>
+        <w:keepNext/>
+        <w:spacing w:after="0" w:before="60"/>
+      </w:pPr>
+      <w:r>
+        <w:rPr>
+          <w:rFonts w:ascii="Calibri" w:cs="Calibri" w:eastAsia="Calibri" w:hAnsi="Calibri"/>
+          <w:b/>
+          <w:bCs/>
+          <w:color w:val="645D52"/>
+          <w:sz w:val="17"/>
+          <w:szCs w:val="17"/>
+        </w:rPr>
+        <w:t xml:space="preserve">What it shows:</w:t>
+      </w:r>
+    </w:p>
+    <w:p>
+      <w:pPr>
         <w:pBdr>
           <w:bottom w:val="single" w:color="C9BFAE" w:sz="4" w:space="1"/>
         </w:pBdr>
@@ -953,6 +1079,21 @@
     </w:p>
     <w:p>
       <w:pPr>
+        <w:pBdr>
+          <w:bottom w:val="single" w:color="C9BFAE" w:sz="4" w:space="1"/>
+        </w:pBdr>
+        <w:spacing w:after="0" w:before="0" w:line="440"/>
+      </w:pPr>
+      <w:r>
+        <w:rPr>
+          <w:sz w:val="20"/>
+          <w:szCs w:val="20"/>
+        </w:rPr>
+        <w:t xml:space="preserve"/>
+      </w:r>
+    </w:p>
+    <w:p>
+      <w:pPr>
         <w:keepNext/>
         <w:spacing w:after="20" w:before="120"/>
       </w:pPr>
@@ -962,10 +1103,287 @@
           <w:b/>
           <w:bCs/>
           <w:color w:val="22304A"/>
-          <w:sz w:val="20"/>
-          <w:szCs w:val="20"/>
-        </w:rPr>
-        <w:t xml:space="preserve">A word or phrase from the passage that backs it up:</w:t>
+          <w:sz w:val="21"/>
+          <w:szCs w:val="21"/>
+        </w:rPr>
+        <w:t xml:space="preserve">Find a line </w:t>
+      </w:r>
+      <w:r>
+        <w:rPr>
+          <w:rFonts w:ascii="Calibri" w:cs="Calibri" w:eastAsia="Calibri" w:hAnsi="Calibri"/>
+          <w:sz w:val="21"/>
+          <w:szCs w:val="21"/>
+        </w:rPr>
+        <w:t xml:space="preserve">… that shows you something about what he notices, and what he does not.</w:t>
+      </w:r>
+    </w:p>
+    <w:p>
+      <w:pPr>
+        <w:keepNext/>
+        <w:spacing w:after="0" w:before="0"/>
+      </w:pPr>
+      <w:r>
+        <w:rPr>
+          <w:rFonts w:ascii="Calibri" w:cs="Calibri" w:eastAsia="Calibri" w:hAnsi="Calibri"/>
+          <w:b/>
+          <w:bCs/>
+          <w:color w:val="645D52"/>
+          <w:sz w:val="17"/>
+          <w:szCs w:val="17"/>
+        </w:rPr>
+        <w:t xml:space="preserve">The line:</w:t>
+      </w:r>
+    </w:p>
+    <w:p>
+      <w:pPr>
+        <w:pBdr>
+          <w:bottom w:val="single" w:color="C9BFAE" w:sz="4" w:space="1"/>
+        </w:pBdr>
+        <w:spacing w:after="0" w:before="0" w:line="440"/>
+      </w:pPr>
+      <w:r>
+        <w:rPr>
+          <w:sz w:val="20"/>
+          <w:szCs w:val="20"/>
+        </w:rPr>
+        <w:t xml:space="preserve"/>
+      </w:r>
+    </w:p>
+    <w:p>
+      <w:pPr>
+        <w:pBdr>
+          <w:bottom w:val="single" w:color="C9BFAE" w:sz="4" w:space="1"/>
+        </w:pBdr>
+        <w:spacing w:after="0" w:before="0" w:line="440"/>
+      </w:pPr>
+      <w:r>
+        <w:rPr>
+          <w:sz w:val="20"/>
+          <w:szCs w:val="20"/>
+        </w:rPr>
+        <w:t xml:space="preserve"/>
+      </w:r>
+    </w:p>
+    <w:p>
+      <w:pPr>
+        <w:keepNext/>
+        <w:spacing w:after="0" w:before="60"/>
+      </w:pPr>
+      <w:r>
+        <w:rPr>
+          <w:rFonts w:ascii="Calibri" w:cs="Calibri" w:eastAsia="Calibri" w:hAnsi="Calibri"/>
+          <w:b/>
+          <w:bCs/>
+          <w:color w:val="645D52"/>
+          <w:sz w:val="17"/>
+          <w:szCs w:val="17"/>
+        </w:rPr>
+        <w:t xml:space="preserve">What it shows:</w:t>
+      </w:r>
+    </w:p>
+    <w:p>
+      <w:pPr>
+        <w:pBdr>
+          <w:bottom w:val="single" w:color="C9BFAE" w:sz="4" w:space="1"/>
+        </w:pBdr>
+        <w:spacing w:after="0" w:before="0" w:line="440"/>
+      </w:pPr>
+      <w:r>
+        <w:rPr>
+          <w:sz w:val="20"/>
+          <w:szCs w:val="20"/>
+        </w:rPr>
+        <w:t xml:space="preserve"/>
+      </w:r>
+    </w:p>
+    <w:p>
+      <w:pPr>
+        <w:pBdr>
+          <w:bottom w:val="single" w:color="C9BFAE" w:sz="4" w:space="1"/>
+        </w:pBdr>
+        <w:spacing w:after="0" w:before="0" w:line="440"/>
+      </w:pPr>
+      <w:r>
+        <w:rPr>
+          <w:sz w:val="20"/>
+          <w:szCs w:val="20"/>
+        </w:rPr>
+        <w:t xml:space="preserve"/>
+      </w:r>
+    </w:p>
+    <w:p>
+      <w:pPr>
+        <w:keepNext/>
+        <w:spacing w:after="20" w:before="120"/>
+      </w:pPr>
+      <w:r>
+        <w:rPr>
+          <w:rFonts w:ascii="Calibri" w:cs="Calibri" w:eastAsia="Calibri" w:hAnsi="Calibri"/>
+          <w:b/>
+          <w:bCs/>
+          <w:color w:val="22304A"/>
+          <w:sz w:val="21"/>
+          <w:szCs w:val="21"/>
+        </w:rPr>
+        <w:t xml:space="preserve">Find a line </w:t>
+      </w:r>
+      <w:r>
+        <w:rPr>
+          <w:rFonts w:ascii="Calibri" w:cs="Calibri" w:eastAsia="Calibri" w:hAnsi="Calibri"/>
+          <w:sz w:val="21"/>
+          <w:szCs w:val="21"/>
+        </w:rPr>
+        <w:t xml:space="preserve">… that shows you something about how he feels, without saying it.</w:t>
+      </w:r>
+    </w:p>
+    <w:p>
+      <w:pPr>
+        <w:keepNext/>
+        <w:spacing w:after="0" w:before="0"/>
+      </w:pPr>
+      <w:r>
+        <w:rPr>
+          <w:rFonts w:ascii="Calibri" w:cs="Calibri" w:eastAsia="Calibri" w:hAnsi="Calibri"/>
+          <w:b/>
+          <w:bCs/>
+          <w:color w:val="645D52"/>
+          <w:sz w:val="17"/>
+          <w:szCs w:val="17"/>
+        </w:rPr>
+        <w:t xml:space="preserve">The line:</w:t>
+      </w:r>
+    </w:p>
+    <w:p>
+      <w:pPr>
+        <w:pBdr>
+          <w:bottom w:val="single" w:color="C9BFAE" w:sz="4" w:space="1"/>
+        </w:pBdr>
+        <w:spacing w:after="0" w:before="0" w:line="440"/>
+      </w:pPr>
+      <w:r>
+        <w:rPr>
+          <w:sz w:val="20"/>
+          <w:szCs w:val="20"/>
+        </w:rPr>
+        <w:t xml:space="preserve"/>
+      </w:r>
+    </w:p>
+    <w:p>
+      <w:pPr>
+        <w:pBdr>
+          <w:bottom w:val="single" w:color="C9BFAE" w:sz="4" w:space="1"/>
+        </w:pBdr>
+        <w:spacing w:after="0" w:before="0" w:line="440"/>
+      </w:pPr>
+      <w:r>
+        <w:rPr>
+          <w:sz w:val="20"/>
+          <w:szCs w:val="20"/>
+        </w:rPr>
+        <w:t xml:space="preserve"/>
+      </w:r>
+    </w:p>
+    <w:p>
+      <w:pPr>
+        <w:keepNext/>
+        <w:spacing w:after="0" w:before="60"/>
+      </w:pPr>
+      <w:r>
+        <w:rPr>
+          <w:rFonts w:ascii="Calibri" w:cs="Calibri" w:eastAsia="Calibri" w:hAnsi="Calibri"/>
+          <w:b/>
+          <w:bCs/>
+          <w:color w:val="645D52"/>
+          <w:sz w:val="17"/>
+          <w:szCs w:val="17"/>
+        </w:rPr>
+        <w:t xml:space="preserve">What it shows:</w:t>
+      </w:r>
+    </w:p>
+    <w:p>
+      <w:pPr>
+        <w:pBdr>
+          <w:bottom w:val="single" w:color="C9BFAE" w:sz="4" w:space="1"/>
+        </w:pBdr>
+        <w:spacing w:after="0" w:before="0" w:line="440"/>
+      </w:pPr>
+      <w:r>
+        <w:rPr>
+          <w:sz w:val="20"/>
+          <w:szCs w:val="20"/>
+        </w:rPr>
+        <w:t xml:space="preserve"/>
+      </w:r>
+    </w:p>
+    <w:p>
+      <w:pPr>
+        <w:pBdr>
+          <w:bottom w:val="single" w:color="C9BFAE" w:sz="4" w:space="1"/>
+        </w:pBdr>
+        <w:spacing w:after="0" w:before="0" w:line="440"/>
+      </w:pPr>
+      <w:r>
+        <w:rPr>
+          <w:sz w:val="20"/>
+          <w:szCs w:val="20"/>
+        </w:rPr>
+        <w:t xml:space="preserve"/>
+      </w:r>
+    </w:p>
+    <w:p>
+      <w:pPr>
+        <w:spacing w:after="60" w:before="200"/>
+      </w:pPr>
+      <w:r>
+        <w:rPr>
+          <w:rFonts w:ascii="Calibri" w:cs="Calibri" w:eastAsia="Calibri" w:hAnsi="Calibri"/>
+          <w:b/>
+          <w:bCs/>
+          <w:color w:val="22304A"/>
+          <w:sz w:val="20"/>
+          <w:szCs w:val="20"/>
+        </w:rPr>
+        <w:t xml:space="preserve">Panel talk. </w:t>
+      </w:r>
+      <w:r>
+        <w:rPr>
+          <w:rFonts w:ascii="Calibri" w:cs="Calibri" w:eastAsia="Calibri" w:hAnsi="Calibri"/>
+          <w:sz w:val="20"/>
+          <w:szCs w:val="20"/>
+        </w:rPr>
+        <w:t xml:space="preserve">Groups of four. Someone reads. What happens, how is it written, what does it show. Every turn starts with “Yes, and …” or a question to the last speaker.</w:t>
+      </w:r>
+    </w:p>
+    <w:p>
+      <w:pPr>
+        <w:keepNext/>
+        <w:spacing w:after="20" w:before="60"/>
+      </w:pPr>
+      <w:r>
+        <w:rPr>
+          <w:rFonts w:ascii="Calibri" w:cs="Calibri" w:eastAsia="Calibri" w:hAnsi="Calibri"/>
+          <w:b/>
+          <w:bCs/>
+          <w:color w:val="22304A"/>
+          <w:sz w:val="20"/>
+          <w:szCs w:val="20"/>
+        </w:rPr>
+        <w:t xml:space="preserve">The one thing our table would tell the class, and the words that back it up:</w:t>
+      </w:r>
+    </w:p>
+    <w:p>
+      <w:pPr>
+        <w:pBdr>
+          <w:bottom w:val="single" w:color="C9BFAE" w:sz="4" w:space="1"/>
+        </w:pBdr>
+        <w:spacing w:after="0" w:before="0" w:line="440"/>
+      </w:pPr>
+      <w:r>
+        <w:rPr>
+          <w:sz w:val="20"/>
+          <w:szCs w:val="20"/>
+        </w:rPr>
+        <w:t xml:space="preserve"/>
       </w:r>
     </w:p>
     <w:p>

</xml_diff>